<commit_message>
docs: status screenshots (Cadence VM running, report pages); report PDF
Co-Authored-By: Claude Sonnet 5.5 <noreply@anthropic.com>
</commit_message>
<xml_diff>
--- a/report/Local_Simulation_Report.docx
+++ b/report/Local_Simulation_Report.docx
@@ -710,7 +710,7 @@
       <w:r>
         <w:drawing>
           <wp:inline xmlns:a="http://schemas.openxmlformats.org/drawingml/2006/main" xmlns:pic="http://schemas.openxmlformats.org/drawingml/2006/picture">
-            <wp:extent cx="5940000" cy="4629419"/>
+            <wp:extent cx="5940000" cy="4877190"/>
             <wp:docPr id="2" name="Picture 2"/>
             <wp:cNvGraphicFramePr>
               <a:graphicFrameLocks noChangeAspect="1"/>
@@ -731,7 +731,7 @@
                   <pic:spPr>
                     <a:xfrm>
                       <a:off x="0" y="0"/>
-                      <a:ext cx="5940000" cy="4629419"/>
+                      <a:ext cx="5940000" cy="4877190"/>
                     </a:xfrm>
                     <a:prstGeom prst="rect"/>
                   </pic:spPr>
@@ -981,7 +981,7 @@
                 <w:b w:val="0"/>
                 <w:sz w:val="17"/>
               </w:rPr>
-              <w:t>NMOS (nmos)</w:t>
+              <w:t>NMOS</w:t>
             </w:r>
           </w:p>
         </w:tc>
@@ -1127,7 +1127,7 @@
                 <w:b w:val="0"/>
                 <w:sz w:val="17"/>
               </w:rPr>
-              <w:t>NMOS (nmos)</w:t>
+              <w:t>NMOS</w:t>
             </w:r>
           </w:p>
         </w:tc>
@@ -1273,7 +1273,7 @@
                 <w:b w:val="0"/>
                 <w:sz w:val="17"/>
               </w:rPr>
-              <w:t>NMOS (nmos)</w:t>
+              <w:t>NMOS</w:t>
             </w:r>
           </w:p>
         </w:tc>
@@ -1419,7 +1419,7 @@
                 <w:b w:val="0"/>
                 <w:sz w:val="17"/>
               </w:rPr>
-              <w:t>NMOS (nmos)</w:t>
+              <w:t>NMOS</w:t>
             </w:r>
           </w:p>
         </w:tc>
@@ -1565,7 +1565,7 @@
                 <w:b w:val="0"/>
                 <w:sz w:val="17"/>
               </w:rPr>
-              <w:t>NMOS (nmos)</w:t>
+              <w:t>NMOS</w:t>
             </w:r>
           </w:p>
         </w:tc>
@@ -1711,7 +1711,7 @@
                 <w:b w:val="0"/>
                 <w:sz w:val="17"/>
               </w:rPr>
-              <w:t>NMOS (nmos)</w:t>
+              <w:t>NMOS</w:t>
             </w:r>
           </w:p>
         </w:tc>
@@ -1857,7 +1857,7 @@
                 <w:b w:val="0"/>
                 <w:sz w:val="17"/>
               </w:rPr>
-              <w:t>NMOS (nmos)</w:t>
+              <w:t>NMOS</w:t>
             </w:r>
           </w:p>
         </w:tc>
@@ -2093,7 +2093,7 @@
                 <w:b w:val="0"/>
                 <w:sz w:val="17"/>
               </w:rPr>
-              <w:t>value</w:t>
+              <w:t>-</w:t>
             </w:r>
           </w:p>
         </w:tc>
@@ -2239,7 +2239,7 @@
                 <w:b w:val="0"/>
                 <w:sz w:val="17"/>
               </w:rPr>
-              <w:t>value</w:t>
+              <w:t>-</w:t>
             </w:r>
           </w:p>
         </w:tc>

</xml_diff>